<commit_message>
codepath: tailor the résumé
Starts from the Wayfinder copy. Summary leads with flows, IA and design
systems; the design system bullet moves to the top of Encoura; onboarding
bullet names the account work; AI prototyping and analytics merged into one
bullet to keep it to a page; skills list user flows, specs and discovery.

Co-Authored-By: Claude Opus 5.5 <noreply@anthropic.com>
Claude-Session: https://claude.ai/code/session_01A7q7qeaBWJSgyZcZHVnALQ
</commit_message>
<xml_diff>
--- a/codepath/resume.docx
+++ b/codepath/resume.docx
@@ -140,7 +140,7 @@
           <w:iCs w:val="1"/>
           <w:rtl w:val="0"/>
         </w:rPr>
-        <w:t xml:space="preserve">Product designer building usable K-12 discovery and guidance tools, backed by learning science.</w:t>
+        <w:t xml:space="preserve">Ed-tech product designer for user flows, information architecture, and design systems.</w:t>
       </w:r>
       <w:r>
         <w:rPr>
@@ -240,7 +240,7 @@
           <w:ilvl w:val="0"/>
           <w:numId w:val="1"/>
         </w:numPr>
-        <w:spacing w:after="200" w:before="200" w:lineRule="auto"/>
+        <w:spacing w:after="200" w:before="100" w:lineRule="auto"/>
         <w:ind w:left="540.0000000000001" w:hanging="359.9999999999999"/>
         <w:rPr>
           <w:rFonts w:ascii="Arial" w:cs="Arial" w:eastAsia="Arial" w:hAnsi="Arial"/>
@@ -323,7 +323,36 @@
           <w:ilvl w:val="0"/>
           <w:numId w:val="1"/>
         </w:numPr>
-        <w:spacing w:after="200" w:before="200" w:line="240" w:lineRule="auto"/>
+        <w:spacing w:after="200" w:before="100" w:line="240" w:lineRule="auto"/>
+        <w:ind w:left="540.0000000000001" w:hanging="359.9999999999999"/>
+        <w:rPr>
+          <w:rFonts w:ascii="Arial" w:cs="Arial" w:eastAsia="Arial" w:hAnsi="Arial"/>
+        </w:rPr>
+      </w:pPr>
+      <w:r>
+        <w:rPr>
+          <w:rFonts w:ascii="Arial" w:cs="Arial" w:eastAsia="Arial" w:hAnsi="Arial"/>
+          <w:b w:val="0"/>
+          <w:bCs w:val="0"/>
+          <w:rtl w:val="0"/>
+        </w:rPr>
+        <w:t xml:space="preserve">Own the Encourage Design System; re-architected its governance so engineers and designers compose from consistent components with no case-by-case review.</w:t>
+      </w:r>
+      <w:r>
+        <w:rPr>
+          <w:rtl w:val="0"/>
+        </w:rPr>
+      </w:r>
+    </w:p>
+    <w:p>
+      <w:pPr>
+        <w:pStyle w:val="Heading3"/>
+        <w:pageBreakBefore w:val="0"/>
+        <w:numPr>
+          <w:ilvl w:val="0"/>
+          <w:numId w:val="1"/>
+        </w:numPr>
+        <w:spacing w:after="200" w:before="100" w:line="240" w:lineRule="auto"/>
         <w:ind w:left="540.0000000000001" w:hanging="359.9999999999999"/>
         <w:rPr>
           <w:rFonts w:ascii="Arial" w:cs="Arial" w:eastAsia="Arial" w:hAnsi="Arial"/>
@@ -338,7 +367,38 @@
           <w:bCs w:val="0"/>
           <w:rtl w:val="0"/>
         </w:rPr>
-        <w:t xml:space="preserve">Redesigned onboarding for a 2x longer intake survey maintaining completion rates using chunking and micro-interactions to cut cognitive load; built Encoura's first in-app A/B test. </w:t>
+        <w:t xml:space="preserve">Rebuilt student onboarding and accounts from classroom research; doubled the intake survey yet held completion near 84% in Encoura's first in-app A/B test.</w:t>
+      </w:r>
+      <w:r>
+        <w:rPr>
+          <w:rtl w:val="0"/>
+        </w:rPr>
+      </w:r>
+    </w:p>
+    <w:p>
+      <w:pPr>
+        <w:pStyle w:val="Heading3"/>
+        <w:numPr>
+          <w:ilvl w:val="0"/>
+          <w:numId w:val="1"/>
+        </w:numPr>
+        <w:spacing w:after="200" w:lineRule="auto"/>
+        <w:ind w:left="540.0000000000001" w:hanging="359.9999999999999"/>
+        <w:rPr>
+          <w:rFonts w:ascii="Arial" w:cs="Arial" w:eastAsia="Arial" w:hAnsi="Arial"/>
+        </w:rPr>
+      </w:pPr>
+      <w:bookmarkStart w:colFirst="0" w:colLast="0" w:name="_heading=h.j0ng1hyib37" w:id="8"/>
+      <w:bookmarkEnd w:id="8"/>
+      <w:r>
+        <w:rPr>
+          <w:rFonts w:ascii="Arial" w:cs="Arial" w:eastAsia="Arial" w:hAnsi="Arial"/>
+          <w:b w:val="0"/>
+          <w:bCs w:val="0"/>
+          <w:highlight w:val="white"/>
+          <w:rtl w:val="0"/>
+        </w:rPr>
+        <w:t xml:space="preserve">Built the counselor workflow side of Encourage for Educators, including student status tracking and roster tools used to manage hundreds of students simultaneously.</w:t>
       </w:r>
       <w:r>
         <w:rPr>
@@ -369,7 +429,7 @@
           <w:bCs w:val="0"/>
           <w:rtl w:val="0"/>
         </w:rPr>
-        <w:t xml:space="preserve">Led migration of Encourage to cross-platform React Native, redesigning layouts to hold up across school-issued devices and WCAG 2.1 AA standards.</w:t>
+        <w:t xml:space="preserve">Led the migration of Encourage (150,000+ students) to React Native, redesigning layouts to hold up on school-issued devices and meet WCAG 2.1 AA.</w:t>
       </w:r>
       <w:r>
         <w:rPr>
@@ -391,17 +451,62 @@
           <w:rFonts w:ascii="Arial" w:cs="Arial" w:eastAsia="Arial" w:hAnsi="Arial"/>
         </w:rPr>
       </w:pPr>
-      <w:bookmarkStart w:colFirst="0" w:colLast="0" w:name="_heading=h.jrnv5zbj20hv" w:id="7"/>
-      <w:bookmarkEnd w:id="7"/>
       <w:r>
         <w:rPr>
           <w:rFonts w:ascii="Arial" w:cs="Arial" w:eastAsia="Arial" w:hAnsi="Arial"/>
           <w:b w:val="0"/>
           <w:bCs w:val="0"/>
-          <w:highlight w:val="white"/>
-          <w:rtl w:val="0"/>
-        </w:rPr>
-        <w:t xml:space="preserve">Owned the Encourage Design System, re-architected governance so engineers and designers compose from consistent components with no case-by-case review.</w:t>
+          <w:rtl w:val="0"/>
+        </w:rPr>
+        <w:t xml:space="preserve">Pioneered AI prototyping at Encoura with Figma Make and Claude Code; drive much of the team's product analytics and first connected Pendo to Claude Code over MCP.</w:t>
+      </w:r>
+      <w:r>
+        <w:rPr>
+          <w:rtl w:val="0"/>
+        </w:rPr>
+      </w:r>
+    </w:p>
+    <w:p>
+      <w:pPr>
+        <w:pStyle w:val="Heading3"/>
+        <w:rPr>
+          <w:rFonts w:ascii="Arial" w:cs="Arial" w:eastAsia="Arial" w:hAnsi="Arial"/>
+          <w:i w:val="1"/>
+          <w:iCs w:val="1"/>
+        </w:rPr>
+      </w:pPr>
+      <w:bookmarkStart w:colFirst="0" w:colLast="0" w:name="_heading=h.5wkar0gi1bq5" w:id="9"/>
+      <w:bookmarkEnd w:id="9"/>
+      <w:r>
+        <w:rPr>
+          <w:rFonts w:ascii="Arial" w:cs="Arial" w:eastAsia="Arial" w:hAnsi="Arial"/>
+          <w:rtl w:val="0"/>
+        </w:rPr>
+        <w:t xml:space="preserve">Rochester Regional Health — </w:t>
+      </w:r>
+      <w:r>
+        <w:rPr>
+          <w:rFonts w:ascii="Arial" w:cs="Arial" w:eastAsia="Arial" w:hAnsi="Arial"/>
+          <w:b w:val="0"/>
+          <w:bCs w:val="0"/>
+          <w:i w:val="1"/>
+          <w:iCs w:val="1"/>
+          <w:rtl w:val="0"/>
+        </w:rPr>
+        <w:t xml:space="preserve">UX/UI Intern  </w:t>
+        <w:tab/>
+        <w:t xml:space="preserve"> </w:t>
+        <w:tab/>
+        <w:tab/>
+        <w:tab/>
+        <w:t xml:space="preserve"> </w:t>
+      </w:r>
+      <w:r>
+        <w:rPr>
+          <w:rFonts w:ascii="Arial" w:cs="Arial" w:eastAsia="Arial" w:hAnsi="Arial"/>
+          <w:rtl w:val="0"/>
+        </w:rPr>
+        <w:t xml:space="preserve">Feb 2020 - Aug 2020</w:t>
       </w:r>
       <w:r>
         <w:rPr>
@@ -416,14 +521,14 @@
           <w:ilvl w:val="0"/>
           <w:numId w:val="1"/>
         </w:numPr>
-        <w:spacing w:after="200" w:lineRule="auto"/>
+        <w:spacing w:after="200" w:before="100" w:lineRule="auto"/>
         <w:ind w:left="540.0000000000001" w:hanging="359.9999999999999"/>
         <w:rPr>
           <w:rFonts w:ascii="Arial" w:cs="Arial" w:eastAsia="Arial" w:hAnsi="Arial"/>
         </w:rPr>
       </w:pPr>
-      <w:bookmarkStart w:colFirst="0" w:colLast="0" w:name="_heading=h.j0ng1hyib37" w:id="8"/>
-      <w:bookmarkEnd w:id="8"/>
+      <w:bookmarkStart w:colFirst="0" w:colLast="0" w:name="_heading=h.e9155ujwlkp5" w:id="10"/>
+      <w:bookmarkEnd w:id="10"/>
       <w:r>
         <w:rPr>
           <w:rFonts w:ascii="Arial" w:cs="Arial" w:eastAsia="Arial" w:hAnsi="Arial"/>
@@ -432,105 +537,8 @@
           <w:highlight w:val="white"/>
           <w:rtl w:val="0"/>
         </w:rPr>
-        <w:t xml:space="preserve">Built the counselor workflow side of Encourage for Educators, including student status tracking and roster tools used to manage hundreds of students simultaneously.</w:t>
-      </w:r>
-      <w:r>
-        <w:rPr>
-          <w:rtl w:val="0"/>
-        </w:rPr>
-      </w:r>
-    </w:p>
-    <w:p>
-      <w:pPr>
-        <w:pStyle w:val="Heading3"/>
-        <w:rPr>
-          <w:rFonts w:ascii="Arial" w:cs="Arial" w:eastAsia="Arial" w:hAnsi="Arial"/>
-          <w:i w:val="1"/>
-          <w:iCs w:val="1"/>
-        </w:rPr>
-      </w:pPr>
-      <w:bookmarkStart w:colFirst="0" w:colLast="0" w:name="_heading=h.5wkar0gi1bq5" w:id="9"/>
-      <w:bookmarkEnd w:id="9"/>
-      <w:r>
-        <w:rPr>
-          <w:rFonts w:ascii="Arial" w:cs="Arial" w:eastAsia="Arial" w:hAnsi="Arial"/>
-          <w:rtl w:val="0"/>
-        </w:rPr>
-        <w:t xml:space="preserve">Rochester Regional Health — </w:t>
-      </w:r>
-      <w:r>
-        <w:rPr>
-          <w:rFonts w:ascii="Arial" w:cs="Arial" w:eastAsia="Arial" w:hAnsi="Arial"/>
-          <w:b w:val="0"/>
-          <w:bCs w:val="0"/>
-          <w:i w:val="1"/>
-          <w:iCs w:val="1"/>
-          <w:rtl w:val="0"/>
-        </w:rPr>
-        <w:t xml:space="preserve">UX/UI Intern  </w:t>
-        <w:tab/>
-        <w:t xml:space="preserve"> </w:t>
-        <w:tab/>
-        <w:tab/>
-        <w:tab/>
-        <w:t xml:space="preserve"> </w:t>
-      </w:r>
-      <w:r>
-        <w:rPr>
-          <w:rFonts w:ascii="Arial" w:cs="Arial" w:eastAsia="Arial" w:hAnsi="Arial"/>
-          <w:rtl w:val="0"/>
-        </w:rPr>
-        <w:t xml:space="preserve">Feb 2020 - Aug 2020</w:t>
-      </w:r>
-      <w:r>
-        <w:rPr>
-          <w:rtl w:val="0"/>
-        </w:rPr>
-      </w:r>
-    </w:p>
-    <w:p>
-      <w:pPr>
-        <w:pStyle w:val="Heading3"/>
-        <w:numPr>
-          <w:ilvl w:val="0"/>
-          <w:numId w:val="1"/>
-        </w:numPr>
-        <w:spacing w:before="200" w:lineRule="auto"/>
-        <w:ind w:left="540.0000000000001" w:hanging="359.9999999999999"/>
-        <w:rPr>
-          <w:rFonts w:ascii="Arial" w:cs="Arial" w:eastAsia="Arial" w:hAnsi="Arial"/>
-        </w:rPr>
-      </w:pPr>
-      <w:bookmarkStart w:colFirst="0" w:colLast="0" w:name="_heading=h.e9155ujwlkp5" w:id="10"/>
-      <w:bookmarkEnd w:id="10"/>
-      <w:r>
-        <w:rPr>
-          <w:rFonts w:ascii="Arial" w:cs="Arial" w:eastAsia="Arial" w:hAnsi="Arial"/>
-          <w:b w:val="0"/>
-          <w:bCs w:val="0"/>
-          <w:highlight w:val="white"/>
-          <w:rtl w:val="0"/>
-        </w:rPr>
         <w:t xml:space="preserve">Designed a contact tracing system for Rochester Institute of Technology to monitor the spread of COVID-19 for over 18,000 students and staff, reducing user workload by half.</w:t>
       </w:r>
-      <w:r>
-        <w:rPr>
-          <w:rtl w:val="0"/>
-        </w:rPr>
-      </w:r>
-    </w:p>
-    <w:p>
-      <w:pPr>
-        <w:pStyle w:val="Heading3"/>
-        <w:ind w:left="0" w:firstLine="0"/>
-        <w:rPr>
-          <w:rFonts w:ascii="Arial" w:cs="Arial" w:eastAsia="Arial" w:hAnsi="Arial"/>
-          <w:b w:val="0"/>
-          <w:bCs w:val="0"/>
-        </w:rPr>
-      </w:pPr>
-      <w:bookmarkStart w:colFirst="0" w:colLast="0" w:name="_heading=h.axn974bmv2ir" w:id="11"/>
-      <w:bookmarkEnd w:id="11"/>
       <w:r>
         <w:rPr>
           <w:rtl w:val="0"/>
@@ -591,7 +599,7 @@
           <w:ilvl w:val="0"/>
           <w:numId w:val="2"/>
         </w:numPr>
-        <w:spacing w:before="200" w:lineRule="auto"/>
+        <w:spacing w:after="100" w:before="100" w:lineRule="auto"/>
         <w:ind w:left="540.0000000000001" w:hanging="359.9999999999999"/>
         <w:rPr>
           <w:rFonts w:ascii="Arial" w:cs="Arial" w:eastAsia="Arial" w:hAnsi="Arial"/>
@@ -609,7 +617,7 @@
           <w:highlight w:val="white"/>
           <w:rtl w:val="0"/>
         </w:rPr>
-        <w:t xml:space="preserve">Conducted usability tests and user interviews with insurance brokers on a Salesforce CRM application to validate user-friendliness and accessibility of new features and updates.​​ </w:t>
+        <w:t xml:space="preserve">Conducted usability tests and user interviews with insurance brokers on a Salesforce CRM application to validate the usability and accessibility of new features.​​ </w:t>
       </w:r>
       <w:r>
         <w:rPr>
@@ -833,7 +841,7 @@
     </w:p>
     <w:p>
       <w:pPr>
-        <w:spacing w:before="200" w:line="240" w:lineRule="auto"/>
+        <w:spacing w:before="90" w:line="240" w:lineRule="auto"/>
         <w:rPr>
           <w:rFonts w:ascii="Arial" w:cs="Arial" w:eastAsia="Arial" w:hAnsi="Arial"/>
           <w:sz w:val="22"/>
@@ -858,12 +866,12 @@
           <w:szCs w:val="22"/>
           <w:rtl w:val="0"/>
         </w:rPr>
-        <w:t xml:space="preserve">Information Architecture, Wireframing, Prototyping, Design Systems, UX Writing</w:t>
-      </w:r>
-    </w:p>
-    <w:p>
-      <w:pPr>
-        <w:spacing w:before="200" w:line="240" w:lineRule="auto"/>
+        <w:t xml:space="preserve">User Flows, IA, Wireframes &amp; Specs, Design Systems, Prototyping</w:t>
+      </w:r>
+    </w:p>
+    <w:p>
+      <w:pPr>
+        <w:spacing w:before="90" w:line="240" w:lineRule="auto"/>
         <w:rPr>
           <w:rFonts w:ascii="Arial" w:cs="Arial" w:eastAsia="Arial" w:hAnsi="Arial"/>
           <w:sz w:val="22"/>
@@ -879,21 +887,21 @@
           <w:szCs w:val="22"/>
           <w:rtl w:val="0"/>
         </w:rPr>
-        <w:t xml:space="preserve">Front-End: </w:t>
-      </w:r>
-      <w:r>
-        <w:rPr>
-          <w:rFonts w:ascii="Arial" w:cs="Arial" w:eastAsia="Arial" w:hAnsi="Arial"/>
-          <w:sz w:val="22"/>
-          <w:szCs w:val="22"/>
-          <w:rtl w:val="0"/>
-        </w:rPr>
-        <w:t xml:space="preserve">HTML, CSS, JavaScript, React Native, AI-Assisted Prototyping (Claude Code)</w:t>
-      </w:r>
-    </w:p>
-    <w:p>
-      <w:pPr>
-        <w:spacing w:before="200" w:line="240" w:lineRule="auto"/>
+        <w:t xml:space="preserve">AI: </w:t>
+      </w:r>
+      <w:r>
+        <w:rPr>
+          <w:rFonts w:ascii="Arial" w:cs="Arial" w:eastAsia="Arial" w:hAnsi="Arial"/>
+          <w:sz w:val="22"/>
+          <w:szCs w:val="22"/>
+          <w:rtl w:val="0"/>
+        </w:rPr>
+        <w:t xml:space="preserve">Figma Make, Claude Code, MCP Integrations (Pendo), AI-Assisted Analysis &amp; Prototyping</w:t>
+      </w:r>
+    </w:p>
+    <w:p>
+      <w:pPr>
+        <w:spacing w:before="90" w:line="240" w:lineRule="auto"/>
         <w:rPr>
           <w:rFonts w:ascii="Arial" w:cs="Arial" w:eastAsia="Arial" w:hAnsi="Arial"/>
           <w:sz w:val="22"/>
@@ -909,21 +917,21 @@
           <w:szCs w:val="22"/>
           <w:rtl w:val="0"/>
         </w:rPr>
-        <w:t xml:space="preserve">Accessibility: </w:t>
-      </w:r>
-      <w:r>
-        <w:rPr>
-          <w:rFonts w:ascii="Arial" w:cs="Arial" w:eastAsia="Arial" w:hAnsi="Arial"/>
-          <w:sz w:val="22"/>
-          <w:szCs w:val="22"/>
-          <w:rtl w:val="0"/>
-        </w:rPr>
-        <w:t xml:space="preserve">WCAG 2.1 AA, CPACC (in progress), Keyboard &amp; Screen-Reader-Aware Design</w:t>
-      </w:r>
-    </w:p>
-    <w:p>
-      <w:pPr>
-        <w:spacing w:before="200" w:line="240" w:lineRule="auto"/>
+        <w:t xml:space="preserve">Front-End: </w:t>
+      </w:r>
+      <w:r>
+        <w:rPr>
+          <w:rFonts w:ascii="Arial" w:cs="Arial" w:eastAsia="Arial" w:hAnsi="Arial"/>
+          <w:sz w:val="22"/>
+          <w:szCs w:val="22"/>
+          <w:rtl w:val="0"/>
+        </w:rPr>
+        <w:t xml:space="preserve">HTML, CSS, JavaScript, React Native</w:t>
+      </w:r>
+    </w:p>
+    <w:p>
+      <w:pPr>
+        <w:spacing w:before="90" w:line="240" w:lineRule="auto"/>
         <w:rPr>
           <w:rFonts w:ascii="Arial" w:cs="Arial" w:eastAsia="Arial" w:hAnsi="Arial"/>
           <w:sz w:val="22"/>
@@ -939,21 +947,21 @@
           <w:szCs w:val="22"/>
           <w:rtl w:val="0"/>
         </w:rPr>
-        <w:t xml:space="preserve">Learning Design: </w:t>
-      </w:r>
-      <w:r>
-        <w:rPr>
-          <w:rFonts w:ascii="Arial" w:cs="Arial" w:eastAsia="Arial" w:hAnsi="Arial"/>
-          <w:sz w:val="22"/>
-          <w:szCs w:val="22"/>
-          <w:rtl w:val="0"/>
-        </w:rPr>
-        <w:t xml:space="preserve">Self-Paced Instruction, ADDIE, Universal Design for Learning</w:t>
-      </w:r>
-    </w:p>
-    <w:p>
-      <w:pPr>
-        <w:spacing w:before="200" w:line="240" w:lineRule="auto"/>
+        <w:t xml:space="preserve">Accessibility: </w:t>
+      </w:r>
+      <w:r>
+        <w:rPr>
+          <w:rFonts w:ascii="Arial" w:cs="Arial" w:eastAsia="Arial" w:hAnsi="Arial"/>
+          <w:sz w:val="22"/>
+          <w:szCs w:val="22"/>
+          <w:rtl w:val="0"/>
+        </w:rPr>
+        <w:t xml:space="preserve">WCAG 2.1 AA, CPACC (in progress), Keyboard &amp; Screen-Reader-Aware Design</w:t>
+      </w:r>
+    </w:p>
+    <w:p>
+      <w:pPr>
+        <w:spacing w:before="90" w:line="240" w:lineRule="auto"/>
         <w:rPr>
           <w:rFonts w:ascii="Arial" w:cs="Arial" w:eastAsia="Arial" w:hAnsi="Arial"/>
           <w:sz w:val="22"/>
@@ -969,6 +977,36 @@
           <w:szCs w:val="22"/>
           <w:rtl w:val="0"/>
         </w:rPr>
+        <w:t xml:space="preserve">Learning Design: </w:t>
+      </w:r>
+      <w:r>
+        <w:rPr>
+          <w:rFonts w:ascii="Arial" w:cs="Arial" w:eastAsia="Arial" w:hAnsi="Arial"/>
+          <w:sz w:val="22"/>
+          <w:szCs w:val="22"/>
+          <w:rtl w:val="0"/>
+        </w:rPr>
+        <w:t xml:space="preserve">Self-Paced Instruction, ADDIE, Universal Design for Learning</w:t>
+      </w:r>
+    </w:p>
+    <w:p>
+      <w:pPr>
+        <w:spacing w:before="90" w:line="240" w:lineRule="auto"/>
+        <w:rPr>
+          <w:rFonts w:ascii="Arial" w:cs="Arial" w:eastAsia="Arial" w:hAnsi="Arial"/>
+          <w:sz w:val="22"/>
+          <w:szCs w:val="22"/>
+        </w:rPr>
+      </w:pPr>
+      <w:r>
+        <w:rPr>
+          <w:rFonts w:ascii="Arial" w:cs="Arial" w:eastAsia="Arial" w:hAnsi="Arial"/>
+          <w:b w:val="1"/>
+          <w:bCs w:val="1"/>
+          <w:sz w:val="22"/>
+          <w:szCs w:val="22"/>
+          <w:rtl w:val="0"/>
+        </w:rPr>
         <w:t xml:space="preserve">Research: </w:t>
       </w:r>
       <w:r>
@@ -978,12 +1016,12 @@
           <w:szCs w:val="22"/>
           <w:rtl w:val="0"/>
         </w:rPr>
-        <w:t xml:space="preserve">Usability Testing, A/B Testing, User Interviews, Survey Design, Contextual Inquiry</w:t>
-      </w:r>
-    </w:p>
-    <w:p>
-      <w:pPr>
-        <w:spacing w:before="200" w:line="240" w:lineRule="auto"/>
+        <w:t xml:space="preserve">Discovery, Interviews, Contextual Inquiry, A/B &amp; Usability Testing, Analytics</w:t>
+      </w:r>
+    </w:p>
+    <w:p>
+      <w:pPr>
+        <w:spacing w:before="90" w:line="240" w:lineRule="auto"/>
         <w:rPr>
           <w:rFonts w:ascii="Arial" w:cs="Arial" w:eastAsia="Arial" w:hAnsi="Arial"/>
           <w:sz w:val="22"/>

</xml_diff>